<commit_message>
Correct reference to NZALC 2026 across web and print versions
Sets the document reference to "NZALC 2026" on the web masthead/footer
and the staff-paper cover/footers, spells the originator's rank in full
in the print version too, and bumps the service-worker cache so
installed clients pick up the regenerated PDF.

Co-Authored-By: Claude Fable 5 <noreply@anthropic.com>
Claude-Session: https://claude.ai/code/session_01YLo1WfwUDkbwfJEF3ZNVbB
</commit_message>
<xml_diff>
--- a/output/capability-note.docx
+++ b/output/capability-note.docx
@@ -121,7 +121,7 @@
           <w:color w:val="000000"/>
           <w:sz w:val="20"/>
         </w:rPr>
-        <w:t>NZALC/____/____</w:t>
+        <w:t>NZALC 2026</w:t>
       </w:r>
     </w:p>
     <w:p>
@@ -179,7 +179,7 @@
           <w:color w:val="000000"/>
           <w:sz w:val="20"/>
         </w:rPr>
-        <w:t>Maj M Coom, Chief Instructor, New Zealand Army Leadership Centre</w:t>
+        <w:t>Major M Coom, Chief Instructor, New Zealand Army Leadership Centre</w:t>
       </w:r>
     </w:p>
     <w:p>
@@ -310,7 +310,7 @@
             </w:rPr>
             <w:fldChar w:fldCharType="separate"/>
           </w:r>
-          <w:hyperlink w:anchor="__RefHeading___Toc769_1871270250">
+          <w:hyperlink w:anchor="__RefHeading___Toc769_3414735432">
             <w:r>
               <w:rPr>
                 <w:webHidden/>
@@ -337,7 +337,7 @@
             </w:tabs>
             <w:rPr/>
           </w:pPr>
-          <w:hyperlink w:anchor="__RefHeading___Toc771_1871270250">
+          <w:hyperlink w:anchor="__RefHeading___Toc771_3414735432">
             <w:r>
               <w:rPr>
                 <w:webHidden/>
@@ -364,7 +364,7 @@
             </w:tabs>
             <w:rPr/>
           </w:pPr>
-          <w:hyperlink w:anchor="__RefHeading___Toc773_1871270250">
+          <w:hyperlink w:anchor="__RefHeading___Toc773_3414735432">
             <w:r>
               <w:rPr>
                 <w:webHidden/>
@@ -391,7 +391,7 @@
             </w:tabs>
             <w:rPr/>
           </w:pPr>
-          <w:hyperlink w:anchor="__RefHeading___Toc775_1871270250">
+          <w:hyperlink w:anchor="__RefHeading___Toc775_3414735432">
             <w:r>
               <w:rPr>
                 <w:webHidden/>
@@ -418,7 +418,7 @@
             </w:tabs>
             <w:rPr/>
           </w:pPr>
-          <w:hyperlink w:anchor="__RefHeading___Toc777_1871270250">
+          <w:hyperlink w:anchor="__RefHeading___Toc777_3414735432">
             <w:r>
               <w:rPr>
                 <w:webHidden/>
@@ -445,7 +445,7 @@
             </w:tabs>
             <w:rPr/>
           </w:pPr>
-          <w:hyperlink w:anchor="__RefHeading___Toc779_1871270250">
+          <w:hyperlink w:anchor="__RefHeading___Toc779_3414735432">
             <w:r>
               <w:rPr>
                 <w:webHidden/>
@@ -472,7 +472,7 @@
             </w:tabs>
             <w:rPr/>
           </w:pPr>
-          <w:hyperlink w:anchor="__RefHeading___Toc781_1871270250">
+          <w:hyperlink w:anchor="__RefHeading___Toc781_3414735432">
             <w:r>
               <w:rPr>
                 <w:webHidden/>
@@ -499,7 +499,7 @@
             </w:tabs>
             <w:rPr/>
           </w:pPr>
-          <w:hyperlink w:anchor="__RefHeading___Toc783_1871270250">
+          <w:hyperlink w:anchor="__RefHeading___Toc783_3414735432">
             <w:r>
               <w:rPr>
                 <w:webHidden/>
@@ -526,7 +526,7 @@
             </w:tabs>
             <w:rPr/>
           </w:pPr>
-          <w:hyperlink w:anchor="__RefHeading___Toc785_1871270250">
+          <w:hyperlink w:anchor="__RefHeading___Toc785_3414735432">
             <w:r>
               <w:rPr>
                 <w:webHidden/>
@@ -553,7 +553,7 @@
             </w:tabs>
             <w:rPr/>
           </w:pPr>
-          <w:hyperlink w:anchor="__RefHeading___Toc787_1871270250">
+          <w:hyperlink w:anchor="__RefHeading___Toc787_3414735432">
             <w:r>
               <w:rPr>
                 <w:webHidden/>
@@ -580,7 +580,7 @@
             </w:tabs>
             <w:rPr/>
           </w:pPr>
-          <w:hyperlink w:anchor="__RefHeading___Toc789_1871270250">
+          <w:hyperlink w:anchor="__RefHeading___Toc789_3414735432">
             <w:r>
               <w:rPr>
                 <w:webHidden/>
@@ -607,7 +607,7 @@
             </w:tabs>
             <w:rPr/>
           </w:pPr>
-          <w:hyperlink w:anchor="__RefHeading___Toc791_1871270250">
+          <w:hyperlink w:anchor="__RefHeading___Toc791_3414735432">
             <w:r>
               <w:rPr>
                 <w:webHidden/>
@@ -634,7 +634,7 @@
             </w:tabs>
             <w:rPr/>
           </w:pPr>
-          <w:hyperlink w:anchor="__RefHeading___Toc793_1871270250">
+          <w:hyperlink w:anchor="__RefHeading___Toc793_3414735432">
             <w:r>
               <w:rPr>
                 <w:webHidden/>
@@ -661,7 +661,7 @@
             </w:tabs>
             <w:rPr/>
           </w:pPr>
-          <w:hyperlink w:anchor="__RefHeading___Toc795_1871270250">
+          <w:hyperlink w:anchor="__RefHeading___Toc795_3414735432">
             <w:r>
               <w:rPr>
                 <w:webHidden/>
@@ -720,7 +720,7 @@
         <w:spacing w:before="0" w:after="160"/>
         <w:rPr/>
       </w:pPr>
-      <w:bookmarkStart w:id="0" w:name="__RefHeading___Toc769_1871270250"/>
+      <w:bookmarkStart w:id="0" w:name="__RefHeading___Toc769_3414735432"/>
       <w:bookmarkEnd w:id="0"/>
       <w:r>
         <w:rPr>
@@ -948,7 +948,7 @@
         </w:pBdr>
         <w:rPr/>
       </w:pPr>
-      <w:bookmarkStart w:id="1" w:name="__RefHeading___Toc771_1871270250"/>
+      <w:bookmarkStart w:id="1" w:name="__RefHeading___Toc771_3414735432"/>
       <w:bookmarkEnd w:id="1"/>
       <w:r>
         <w:rPr>
@@ -1066,7 +1066,7 @@
         </w:pBdr>
         <w:rPr/>
       </w:pPr>
-      <w:bookmarkStart w:id="2" w:name="__RefHeading___Toc773_1871270250"/>
+      <w:bookmarkStart w:id="2" w:name="__RefHeading___Toc773_3414735432"/>
       <w:bookmarkEnd w:id="2"/>
       <w:r>
         <w:rPr>
@@ -1569,7 +1569,7 @@
         </w:pBdr>
         <w:rPr/>
       </w:pPr>
-      <w:bookmarkStart w:id="3" w:name="__RefHeading___Toc775_1871270250"/>
+      <w:bookmarkStart w:id="3" w:name="__RefHeading___Toc775_3414735432"/>
       <w:bookmarkEnd w:id="3"/>
       <w:r>
         <w:rPr>
@@ -2763,7 +2763,7 @@
         </w:pBdr>
         <w:rPr/>
       </w:pPr>
-      <w:bookmarkStart w:id="4" w:name="__RefHeading___Toc777_1871270250"/>
+      <w:bookmarkStart w:id="4" w:name="__RefHeading___Toc777_3414735432"/>
       <w:bookmarkEnd w:id="4"/>
       <w:r>
         <w:rPr>
@@ -3481,7 +3481,7 @@
         </w:pBdr>
         <w:rPr/>
       </w:pPr>
-      <w:bookmarkStart w:id="5" w:name="__RefHeading___Toc779_1871270250"/>
+      <w:bookmarkStart w:id="5" w:name="__RefHeading___Toc779_3414735432"/>
       <w:bookmarkEnd w:id="5"/>
       <w:r>
         <w:rPr>
@@ -4802,7 +4802,7 @@
         </w:pBdr>
         <w:rPr/>
       </w:pPr>
-      <w:bookmarkStart w:id="6" w:name="__RefHeading___Toc781_1871270250"/>
+      <w:bookmarkStart w:id="6" w:name="__RefHeading___Toc781_3414735432"/>
       <w:bookmarkEnd w:id="6"/>
       <w:r>
         <w:rPr>
@@ -5583,7 +5583,7 @@
         </w:pBdr>
         <w:rPr/>
       </w:pPr>
-      <w:bookmarkStart w:id="7" w:name="__RefHeading___Toc783_1871270250"/>
+      <w:bookmarkStart w:id="7" w:name="__RefHeading___Toc783_3414735432"/>
       <w:bookmarkEnd w:id="7"/>
       <w:r>
         <w:rPr>
@@ -6051,7 +6051,7 @@
         </w:pBdr>
         <w:rPr/>
       </w:pPr>
-      <w:bookmarkStart w:id="8" w:name="__RefHeading___Toc785_1871270250"/>
+      <w:bookmarkStart w:id="8" w:name="__RefHeading___Toc785_3414735432"/>
       <w:bookmarkEnd w:id="8"/>
       <w:r>
         <w:rPr>
@@ -8623,7 +8623,7 @@
         </w:pBdr>
         <w:rPr/>
       </w:pPr>
-      <w:bookmarkStart w:id="9" w:name="__RefHeading___Toc787_1871270250"/>
+      <w:bookmarkStart w:id="9" w:name="__RefHeading___Toc787_3414735432"/>
       <w:bookmarkEnd w:id="9"/>
       <w:r>
         <w:rPr>
@@ -8871,7 +8871,7 @@
         </w:pBdr>
         <w:rPr/>
       </w:pPr>
-      <w:bookmarkStart w:id="10" w:name="__RefHeading___Toc789_1871270250"/>
+      <w:bookmarkStart w:id="10" w:name="__RefHeading___Toc789_3414735432"/>
       <w:bookmarkEnd w:id="10"/>
       <w:r>
         <w:rPr>
@@ -9262,7 +9262,7 @@
         </w:pBdr>
         <w:rPr/>
       </w:pPr>
-      <w:bookmarkStart w:id="11" w:name="__RefHeading___Toc791_1871270250"/>
+      <w:bookmarkStart w:id="11" w:name="__RefHeading___Toc791_3414735432"/>
       <w:bookmarkEnd w:id="11"/>
       <w:r>
         <w:rPr>
@@ -9598,7 +9598,7 @@
         </w:pBdr>
         <w:rPr/>
       </w:pPr>
-      <w:bookmarkStart w:id="12" w:name="__RefHeading___Toc793_1871270250"/>
+      <w:bookmarkStart w:id="12" w:name="__RefHeading___Toc793_3414735432"/>
       <w:bookmarkEnd w:id="12"/>
       <w:r>
         <w:rPr>
@@ -9720,7 +9720,7 @@
         </w:pBdr>
         <w:rPr/>
       </w:pPr>
-      <w:bookmarkStart w:id="13" w:name="__RefHeading___Toc795_1871270250"/>
+      <w:bookmarkStart w:id="13" w:name="__RefHeading___Toc795_3414735432"/>
       <w:bookmarkEnd w:id="13"/>
       <w:r>
         <w:rPr>
@@ -10004,7 +10004,7 @@
       </w:rPr>
       <w:t>PUP &amp; Combat Mindset — Capability Note</w:t>
       <w:tab/>
-      <w:t>NZALC/____/____</w:t>
+      <w:t>NZALC 2026</w:t>
       <w:tab/>
       <w:t xml:space="preserve">Page </w:t>
     </w:r>
@@ -10398,7 +10398,7 @@
   <w:style w:type="character" w:styleId="Hyperlink">
     <w:name w:val="Hyperlink"/>
     <w:rPr>
-      <w:color w:val="000000"/>
+      <w:color w:val="000080"/>
       <w:u w:val="single"/>
     </w:rPr>
   </w:style>
@@ -10417,7 +10417,7 @@
       <w:spacing w:before="240" w:after="120"/>
     </w:pPr>
     <w:rPr>
-      <w:rFonts w:ascii="Arial" w:hAnsi="Arial" w:eastAsia="WenQuanYi Zen Hei" w:cs="FreeSans"/>
+      <w:rFonts w:ascii="Liberation Sans" w:hAnsi="Liberation Sans" w:eastAsia="WenQuanYi Zen Hei" w:cs="FreeSans"/>
       <w:sz w:val="28"/>
       <w:szCs w:val="28"/>
     </w:rPr>

</xml_diff>

<commit_message>
Use the fern 'A' mark for app icons; date the paper July 2026
Rebuilds all home-screen icons (192/512/maskable/apple-touch) from the
supplied 'A' mark, cropped of an edge artifact and centred on white.
Sets the staff paper's cover date to July 2026 and regenerates the
docx/PDF. Bumps the service-worker cache so installed clients refresh
icons and PDF.

Co-Authored-By: Claude Fable 5 <noreply@anthropic.com>
Claude-Session: https://claude.ai/code/session_01YLo1WfwUDkbwfJEF3ZNVbB
</commit_message>
<xml_diff>
--- a/output/capability-note.docx
+++ b/output/capability-note.docx
@@ -150,7 +150,7 @@
           <w:color w:val="000000"/>
           <w:sz w:val="20"/>
         </w:rPr>
-        <w:t>____ 2026</w:t>
+        <w:t>July 2026</w:t>
       </w:r>
     </w:p>
     <w:p>
@@ -310,7 +310,7 @@
             </w:rPr>
             <w:fldChar w:fldCharType="separate"/>
           </w:r>
-          <w:hyperlink w:anchor="__RefHeading___Toc769_3414735432">
+          <w:hyperlink w:anchor="__RefHeading___Toc769_2462424401">
             <w:r>
               <w:rPr>
                 <w:webHidden/>
@@ -337,7 +337,7 @@
             </w:tabs>
             <w:rPr/>
           </w:pPr>
-          <w:hyperlink w:anchor="__RefHeading___Toc771_3414735432">
+          <w:hyperlink w:anchor="__RefHeading___Toc771_2462424401">
             <w:r>
               <w:rPr>
                 <w:webHidden/>
@@ -364,7 +364,7 @@
             </w:tabs>
             <w:rPr/>
           </w:pPr>
-          <w:hyperlink w:anchor="__RefHeading___Toc773_3414735432">
+          <w:hyperlink w:anchor="__RefHeading___Toc773_2462424401">
             <w:r>
               <w:rPr>
                 <w:webHidden/>
@@ -391,7 +391,7 @@
             </w:tabs>
             <w:rPr/>
           </w:pPr>
-          <w:hyperlink w:anchor="__RefHeading___Toc775_3414735432">
+          <w:hyperlink w:anchor="__RefHeading___Toc775_2462424401">
             <w:r>
               <w:rPr>
                 <w:webHidden/>
@@ -418,7 +418,7 @@
             </w:tabs>
             <w:rPr/>
           </w:pPr>
-          <w:hyperlink w:anchor="__RefHeading___Toc777_3414735432">
+          <w:hyperlink w:anchor="__RefHeading___Toc777_2462424401">
             <w:r>
               <w:rPr>
                 <w:webHidden/>
@@ -445,7 +445,7 @@
             </w:tabs>
             <w:rPr/>
           </w:pPr>
-          <w:hyperlink w:anchor="__RefHeading___Toc779_3414735432">
+          <w:hyperlink w:anchor="__RefHeading___Toc779_2462424401">
             <w:r>
               <w:rPr>
                 <w:webHidden/>
@@ -472,7 +472,7 @@
             </w:tabs>
             <w:rPr/>
           </w:pPr>
-          <w:hyperlink w:anchor="__RefHeading___Toc781_3414735432">
+          <w:hyperlink w:anchor="__RefHeading___Toc781_2462424401">
             <w:r>
               <w:rPr>
                 <w:webHidden/>
@@ -499,7 +499,7 @@
             </w:tabs>
             <w:rPr/>
           </w:pPr>
-          <w:hyperlink w:anchor="__RefHeading___Toc783_3414735432">
+          <w:hyperlink w:anchor="__RefHeading___Toc783_2462424401">
             <w:r>
               <w:rPr>
                 <w:webHidden/>
@@ -526,7 +526,7 @@
             </w:tabs>
             <w:rPr/>
           </w:pPr>
-          <w:hyperlink w:anchor="__RefHeading___Toc785_3414735432">
+          <w:hyperlink w:anchor="__RefHeading___Toc785_2462424401">
             <w:r>
               <w:rPr>
                 <w:webHidden/>
@@ -553,7 +553,7 @@
             </w:tabs>
             <w:rPr/>
           </w:pPr>
-          <w:hyperlink w:anchor="__RefHeading___Toc787_3414735432">
+          <w:hyperlink w:anchor="__RefHeading___Toc787_2462424401">
             <w:r>
               <w:rPr>
                 <w:webHidden/>
@@ -580,7 +580,7 @@
             </w:tabs>
             <w:rPr/>
           </w:pPr>
-          <w:hyperlink w:anchor="__RefHeading___Toc789_3414735432">
+          <w:hyperlink w:anchor="__RefHeading___Toc789_2462424401">
             <w:r>
               <w:rPr>
                 <w:webHidden/>
@@ -607,7 +607,7 @@
             </w:tabs>
             <w:rPr/>
           </w:pPr>
-          <w:hyperlink w:anchor="__RefHeading___Toc791_3414735432">
+          <w:hyperlink w:anchor="__RefHeading___Toc791_2462424401">
             <w:r>
               <w:rPr>
                 <w:webHidden/>
@@ -634,7 +634,7 @@
             </w:tabs>
             <w:rPr/>
           </w:pPr>
-          <w:hyperlink w:anchor="__RefHeading___Toc793_3414735432">
+          <w:hyperlink w:anchor="__RefHeading___Toc793_2462424401">
             <w:r>
               <w:rPr>
                 <w:webHidden/>
@@ -661,7 +661,7 @@
             </w:tabs>
             <w:rPr/>
           </w:pPr>
-          <w:hyperlink w:anchor="__RefHeading___Toc795_3414735432">
+          <w:hyperlink w:anchor="__RefHeading___Toc795_2462424401">
             <w:r>
               <w:rPr>
                 <w:webHidden/>
@@ -720,7 +720,7 @@
         <w:spacing w:before="0" w:after="160"/>
         <w:rPr/>
       </w:pPr>
-      <w:bookmarkStart w:id="0" w:name="__RefHeading___Toc769_3414735432"/>
+      <w:bookmarkStart w:id="0" w:name="__RefHeading___Toc769_2462424401"/>
       <w:bookmarkEnd w:id="0"/>
       <w:r>
         <w:rPr>
@@ -948,7 +948,7 @@
         </w:pBdr>
         <w:rPr/>
       </w:pPr>
-      <w:bookmarkStart w:id="1" w:name="__RefHeading___Toc771_3414735432"/>
+      <w:bookmarkStart w:id="1" w:name="__RefHeading___Toc771_2462424401"/>
       <w:bookmarkEnd w:id="1"/>
       <w:r>
         <w:rPr>
@@ -1066,7 +1066,7 @@
         </w:pBdr>
         <w:rPr/>
       </w:pPr>
-      <w:bookmarkStart w:id="2" w:name="__RefHeading___Toc773_3414735432"/>
+      <w:bookmarkStart w:id="2" w:name="__RefHeading___Toc773_2462424401"/>
       <w:bookmarkEnd w:id="2"/>
       <w:r>
         <w:rPr>
@@ -1569,7 +1569,7 @@
         </w:pBdr>
         <w:rPr/>
       </w:pPr>
-      <w:bookmarkStart w:id="3" w:name="__RefHeading___Toc775_3414735432"/>
+      <w:bookmarkStart w:id="3" w:name="__RefHeading___Toc775_2462424401"/>
       <w:bookmarkEnd w:id="3"/>
       <w:r>
         <w:rPr>
@@ -2763,7 +2763,7 @@
         </w:pBdr>
         <w:rPr/>
       </w:pPr>
-      <w:bookmarkStart w:id="4" w:name="__RefHeading___Toc777_3414735432"/>
+      <w:bookmarkStart w:id="4" w:name="__RefHeading___Toc777_2462424401"/>
       <w:bookmarkEnd w:id="4"/>
       <w:r>
         <w:rPr>
@@ -3481,7 +3481,7 @@
         </w:pBdr>
         <w:rPr/>
       </w:pPr>
-      <w:bookmarkStart w:id="5" w:name="__RefHeading___Toc779_3414735432"/>
+      <w:bookmarkStart w:id="5" w:name="__RefHeading___Toc779_2462424401"/>
       <w:bookmarkEnd w:id="5"/>
       <w:r>
         <w:rPr>
@@ -4802,7 +4802,7 @@
         </w:pBdr>
         <w:rPr/>
       </w:pPr>
-      <w:bookmarkStart w:id="6" w:name="__RefHeading___Toc781_3414735432"/>
+      <w:bookmarkStart w:id="6" w:name="__RefHeading___Toc781_2462424401"/>
       <w:bookmarkEnd w:id="6"/>
       <w:r>
         <w:rPr>
@@ -5583,7 +5583,7 @@
         </w:pBdr>
         <w:rPr/>
       </w:pPr>
-      <w:bookmarkStart w:id="7" w:name="__RefHeading___Toc783_3414735432"/>
+      <w:bookmarkStart w:id="7" w:name="__RefHeading___Toc783_2462424401"/>
       <w:bookmarkEnd w:id="7"/>
       <w:r>
         <w:rPr>
@@ -6051,7 +6051,7 @@
         </w:pBdr>
         <w:rPr/>
       </w:pPr>
-      <w:bookmarkStart w:id="8" w:name="__RefHeading___Toc785_3414735432"/>
+      <w:bookmarkStart w:id="8" w:name="__RefHeading___Toc785_2462424401"/>
       <w:bookmarkEnd w:id="8"/>
       <w:r>
         <w:rPr>
@@ -8623,7 +8623,7 @@
         </w:pBdr>
         <w:rPr/>
       </w:pPr>
-      <w:bookmarkStart w:id="9" w:name="__RefHeading___Toc787_3414735432"/>
+      <w:bookmarkStart w:id="9" w:name="__RefHeading___Toc787_2462424401"/>
       <w:bookmarkEnd w:id="9"/>
       <w:r>
         <w:rPr>
@@ -8871,7 +8871,7 @@
         </w:pBdr>
         <w:rPr/>
       </w:pPr>
-      <w:bookmarkStart w:id="10" w:name="__RefHeading___Toc789_3414735432"/>
+      <w:bookmarkStart w:id="10" w:name="__RefHeading___Toc789_2462424401"/>
       <w:bookmarkEnd w:id="10"/>
       <w:r>
         <w:rPr>
@@ -9262,7 +9262,7 @@
         </w:pBdr>
         <w:rPr/>
       </w:pPr>
-      <w:bookmarkStart w:id="11" w:name="__RefHeading___Toc791_3414735432"/>
+      <w:bookmarkStart w:id="11" w:name="__RefHeading___Toc791_2462424401"/>
       <w:bookmarkEnd w:id="11"/>
       <w:r>
         <w:rPr>
@@ -9598,7 +9598,7 @@
         </w:pBdr>
         <w:rPr/>
       </w:pPr>
-      <w:bookmarkStart w:id="12" w:name="__RefHeading___Toc793_3414735432"/>
+      <w:bookmarkStart w:id="12" w:name="__RefHeading___Toc793_2462424401"/>
       <w:bookmarkEnd w:id="12"/>
       <w:r>
         <w:rPr>
@@ -9720,7 +9720,7 @@
         </w:pBdr>
         <w:rPr/>
       </w:pPr>
-      <w:bookmarkStart w:id="13" w:name="__RefHeading___Toc795_3414735432"/>
+      <w:bookmarkStart w:id="13" w:name="__RefHeading___Toc795_2462424401"/>
       <w:bookmarkEnd w:id="13"/>
       <w:r>
         <w:rPr>

</xml_diff>

<commit_message>
Correct cover distribution list to COMDT ACS; COMD ATG
Regenerates the docx/PDF with the corrected Distribution row and bumps
the service-worker cache so installed clients fetch the new PDF.

Co-Authored-By: Claude Fable 5 <noreply@anthropic.com>
Claude-Session: https://claude.ai/code/session_01YLo1WfwUDkbwfJEF3ZNVbB
</commit_message>
<xml_diff>
--- a/output/capability-note.docx
+++ b/output/capability-note.docx
@@ -240,7 +240,7 @@
           <w:color w:val="000000"/>
           <w:sz w:val="20"/>
         </w:rPr>
-        <w:t>ACS; Comd ATG; Comd NZALC</w:t>
+        <w:t>COMDT ACS; COMD ATG</w:t>
       </w:r>
     </w:p>
     <w:p>
@@ -310,7 +310,7 @@
             </w:rPr>
             <w:fldChar w:fldCharType="separate"/>
           </w:r>
-          <w:hyperlink w:anchor="__RefHeading___Toc769_2462424401">
+          <w:hyperlink w:anchor="__RefHeading___Toc769_3257256328">
             <w:r>
               <w:rPr>
                 <w:webHidden/>
@@ -337,7 +337,7 @@
             </w:tabs>
             <w:rPr/>
           </w:pPr>
-          <w:hyperlink w:anchor="__RefHeading___Toc771_2462424401">
+          <w:hyperlink w:anchor="__RefHeading___Toc771_3257256328">
             <w:r>
               <w:rPr>
                 <w:webHidden/>
@@ -364,7 +364,7 @@
             </w:tabs>
             <w:rPr/>
           </w:pPr>
-          <w:hyperlink w:anchor="__RefHeading___Toc773_2462424401">
+          <w:hyperlink w:anchor="__RefHeading___Toc773_3257256328">
             <w:r>
               <w:rPr>
                 <w:webHidden/>
@@ -391,7 +391,7 @@
             </w:tabs>
             <w:rPr/>
           </w:pPr>
-          <w:hyperlink w:anchor="__RefHeading___Toc775_2462424401">
+          <w:hyperlink w:anchor="__RefHeading___Toc775_3257256328">
             <w:r>
               <w:rPr>
                 <w:webHidden/>
@@ -418,7 +418,7 @@
             </w:tabs>
             <w:rPr/>
           </w:pPr>
-          <w:hyperlink w:anchor="__RefHeading___Toc777_2462424401">
+          <w:hyperlink w:anchor="__RefHeading___Toc777_3257256328">
             <w:r>
               <w:rPr>
                 <w:webHidden/>
@@ -445,7 +445,7 @@
             </w:tabs>
             <w:rPr/>
           </w:pPr>
-          <w:hyperlink w:anchor="__RefHeading___Toc779_2462424401">
+          <w:hyperlink w:anchor="__RefHeading___Toc779_3257256328">
             <w:r>
               <w:rPr>
                 <w:webHidden/>
@@ -472,7 +472,7 @@
             </w:tabs>
             <w:rPr/>
           </w:pPr>
-          <w:hyperlink w:anchor="__RefHeading___Toc781_2462424401">
+          <w:hyperlink w:anchor="__RefHeading___Toc781_3257256328">
             <w:r>
               <w:rPr>
                 <w:webHidden/>
@@ -499,7 +499,7 @@
             </w:tabs>
             <w:rPr/>
           </w:pPr>
-          <w:hyperlink w:anchor="__RefHeading___Toc783_2462424401">
+          <w:hyperlink w:anchor="__RefHeading___Toc783_3257256328">
             <w:r>
               <w:rPr>
                 <w:webHidden/>
@@ -526,7 +526,7 @@
             </w:tabs>
             <w:rPr/>
           </w:pPr>
-          <w:hyperlink w:anchor="__RefHeading___Toc785_2462424401">
+          <w:hyperlink w:anchor="__RefHeading___Toc785_3257256328">
             <w:r>
               <w:rPr>
                 <w:webHidden/>
@@ -553,7 +553,7 @@
             </w:tabs>
             <w:rPr/>
           </w:pPr>
-          <w:hyperlink w:anchor="__RefHeading___Toc787_2462424401">
+          <w:hyperlink w:anchor="__RefHeading___Toc787_3257256328">
             <w:r>
               <w:rPr>
                 <w:webHidden/>
@@ -580,7 +580,7 @@
             </w:tabs>
             <w:rPr/>
           </w:pPr>
-          <w:hyperlink w:anchor="__RefHeading___Toc789_2462424401">
+          <w:hyperlink w:anchor="__RefHeading___Toc789_3257256328">
             <w:r>
               <w:rPr>
                 <w:webHidden/>
@@ -607,7 +607,7 @@
             </w:tabs>
             <w:rPr/>
           </w:pPr>
-          <w:hyperlink w:anchor="__RefHeading___Toc791_2462424401">
+          <w:hyperlink w:anchor="__RefHeading___Toc791_3257256328">
             <w:r>
               <w:rPr>
                 <w:webHidden/>
@@ -634,7 +634,7 @@
             </w:tabs>
             <w:rPr/>
           </w:pPr>
-          <w:hyperlink w:anchor="__RefHeading___Toc793_2462424401">
+          <w:hyperlink w:anchor="__RefHeading___Toc793_3257256328">
             <w:r>
               <w:rPr>
                 <w:webHidden/>
@@ -661,7 +661,7 @@
             </w:tabs>
             <w:rPr/>
           </w:pPr>
-          <w:hyperlink w:anchor="__RefHeading___Toc795_2462424401">
+          <w:hyperlink w:anchor="__RefHeading___Toc795_3257256328">
             <w:r>
               <w:rPr>
                 <w:webHidden/>
@@ -720,7 +720,7 @@
         <w:spacing w:before="0" w:after="160"/>
         <w:rPr/>
       </w:pPr>
-      <w:bookmarkStart w:id="0" w:name="__RefHeading___Toc769_2462424401"/>
+      <w:bookmarkStart w:id="0" w:name="__RefHeading___Toc769_3257256328"/>
       <w:bookmarkEnd w:id="0"/>
       <w:r>
         <w:rPr>
@@ -948,7 +948,7 @@
         </w:pBdr>
         <w:rPr/>
       </w:pPr>
-      <w:bookmarkStart w:id="1" w:name="__RefHeading___Toc771_2462424401"/>
+      <w:bookmarkStart w:id="1" w:name="__RefHeading___Toc771_3257256328"/>
       <w:bookmarkEnd w:id="1"/>
       <w:r>
         <w:rPr>
@@ -1066,7 +1066,7 @@
         </w:pBdr>
         <w:rPr/>
       </w:pPr>
-      <w:bookmarkStart w:id="2" w:name="__RefHeading___Toc773_2462424401"/>
+      <w:bookmarkStart w:id="2" w:name="__RefHeading___Toc773_3257256328"/>
       <w:bookmarkEnd w:id="2"/>
       <w:r>
         <w:rPr>
@@ -1569,7 +1569,7 @@
         </w:pBdr>
         <w:rPr/>
       </w:pPr>
-      <w:bookmarkStart w:id="3" w:name="__RefHeading___Toc775_2462424401"/>
+      <w:bookmarkStart w:id="3" w:name="__RefHeading___Toc775_3257256328"/>
       <w:bookmarkEnd w:id="3"/>
       <w:r>
         <w:rPr>
@@ -2763,7 +2763,7 @@
         </w:pBdr>
         <w:rPr/>
       </w:pPr>
-      <w:bookmarkStart w:id="4" w:name="__RefHeading___Toc777_2462424401"/>
+      <w:bookmarkStart w:id="4" w:name="__RefHeading___Toc777_3257256328"/>
       <w:bookmarkEnd w:id="4"/>
       <w:r>
         <w:rPr>
@@ -3481,7 +3481,7 @@
         </w:pBdr>
         <w:rPr/>
       </w:pPr>
-      <w:bookmarkStart w:id="5" w:name="__RefHeading___Toc779_2462424401"/>
+      <w:bookmarkStart w:id="5" w:name="__RefHeading___Toc779_3257256328"/>
       <w:bookmarkEnd w:id="5"/>
       <w:r>
         <w:rPr>
@@ -4802,7 +4802,7 @@
         </w:pBdr>
         <w:rPr/>
       </w:pPr>
-      <w:bookmarkStart w:id="6" w:name="__RefHeading___Toc781_2462424401"/>
+      <w:bookmarkStart w:id="6" w:name="__RefHeading___Toc781_3257256328"/>
       <w:bookmarkEnd w:id="6"/>
       <w:r>
         <w:rPr>
@@ -5583,7 +5583,7 @@
         </w:pBdr>
         <w:rPr/>
       </w:pPr>
-      <w:bookmarkStart w:id="7" w:name="__RefHeading___Toc783_2462424401"/>
+      <w:bookmarkStart w:id="7" w:name="__RefHeading___Toc783_3257256328"/>
       <w:bookmarkEnd w:id="7"/>
       <w:r>
         <w:rPr>
@@ -6051,7 +6051,7 @@
         </w:pBdr>
         <w:rPr/>
       </w:pPr>
-      <w:bookmarkStart w:id="8" w:name="__RefHeading___Toc785_2462424401"/>
+      <w:bookmarkStart w:id="8" w:name="__RefHeading___Toc785_3257256328"/>
       <w:bookmarkEnd w:id="8"/>
       <w:r>
         <w:rPr>
@@ -8623,7 +8623,7 @@
         </w:pBdr>
         <w:rPr/>
       </w:pPr>
-      <w:bookmarkStart w:id="9" w:name="__RefHeading___Toc787_2462424401"/>
+      <w:bookmarkStart w:id="9" w:name="__RefHeading___Toc787_3257256328"/>
       <w:bookmarkEnd w:id="9"/>
       <w:r>
         <w:rPr>
@@ -8871,7 +8871,7 @@
         </w:pBdr>
         <w:rPr/>
       </w:pPr>
-      <w:bookmarkStart w:id="10" w:name="__RefHeading___Toc789_2462424401"/>
+      <w:bookmarkStart w:id="10" w:name="__RefHeading___Toc789_3257256328"/>
       <w:bookmarkEnd w:id="10"/>
       <w:r>
         <w:rPr>
@@ -9262,7 +9262,7 @@
         </w:pBdr>
         <w:rPr/>
       </w:pPr>
-      <w:bookmarkStart w:id="11" w:name="__RefHeading___Toc791_2462424401"/>
+      <w:bookmarkStart w:id="11" w:name="__RefHeading___Toc791_3257256328"/>
       <w:bookmarkEnd w:id="11"/>
       <w:r>
         <w:rPr>
@@ -9598,7 +9598,7 @@
         </w:pBdr>
         <w:rPr/>
       </w:pPr>
-      <w:bookmarkStart w:id="12" w:name="__RefHeading___Toc793_2462424401"/>
+      <w:bookmarkStart w:id="12" w:name="__RefHeading___Toc793_3257256328"/>
       <w:bookmarkEnd w:id="12"/>
       <w:r>
         <w:rPr>
@@ -9720,7 +9720,7 @@
         </w:pBdr>
         <w:rPr/>
       </w:pPr>
-      <w:bookmarkStart w:id="13" w:name="__RefHeading___Toc795_2462424401"/>
+      <w:bookmarkStart w:id="13" w:name="__RefHeading___Toc795_3257256328"/>
       <w:bookmarkEnd w:id="13"/>
       <w:r>
         <w:rPr>

</xml_diff>

<commit_message>
Left-align the cover logo ink in the staff paper
Applies the same treatment as the web masthead: the logo is trimmed to
its visible bounding box before placement, so its ink aligns with the
title's left edge instead of inheriting the PNG's transparent margin.
Regenerates docx/PDF and bumps the service-worker cache.

Co-Authored-By: Claude Fable 5 <noreply@anthropic.com>
Claude-Session: https://claude.ai/code/session_01YLo1WfwUDkbwfJEF3ZNVbB
</commit_message>
<xml_diff>
--- a/output/capability-note.docx
+++ b/output/capability-note.docx
@@ -11,7 +11,7 @@
         <w:rPr/>
         <w:drawing>
           <wp:inline distT="0" distB="0" distL="0" distR="0">
-            <wp:extent cx="2160270" cy="577215"/>
+            <wp:extent cx="2160270" cy="521335"/>
             <wp:effectExtent l="0" t="0" r="0" b="0"/>
             <wp:docPr id="1" name="Picture 1" descr=""/>
             <wp:cNvGraphicFramePr>
@@ -35,7 +35,7 @@
                   <pic:spPr bwMode="auto">
                     <a:xfrm>
                       <a:off x="0" y="0"/>
-                      <a:ext cx="2160270" cy="577215"/>
+                      <a:ext cx="2160270" cy="521335"/>
                     </a:xfrm>
                     <a:prstGeom prst="rect">
                       <a:avLst/>
@@ -310,7 +310,7 @@
             </w:rPr>
             <w:fldChar w:fldCharType="separate"/>
           </w:r>
-          <w:hyperlink w:anchor="__RefHeading___Toc769_3257256328">
+          <w:hyperlink w:anchor="__RefHeading___Toc769_1665122091">
             <w:r>
               <w:rPr>
                 <w:webHidden/>
@@ -337,7 +337,7 @@
             </w:tabs>
             <w:rPr/>
           </w:pPr>
-          <w:hyperlink w:anchor="__RefHeading___Toc771_3257256328">
+          <w:hyperlink w:anchor="__RefHeading___Toc771_1665122091">
             <w:r>
               <w:rPr>
                 <w:webHidden/>
@@ -364,7 +364,7 @@
             </w:tabs>
             <w:rPr/>
           </w:pPr>
-          <w:hyperlink w:anchor="__RefHeading___Toc773_3257256328">
+          <w:hyperlink w:anchor="__RefHeading___Toc773_1665122091">
             <w:r>
               <w:rPr>
                 <w:webHidden/>
@@ -391,7 +391,7 @@
             </w:tabs>
             <w:rPr/>
           </w:pPr>
-          <w:hyperlink w:anchor="__RefHeading___Toc775_3257256328">
+          <w:hyperlink w:anchor="__RefHeading___Toc775_1665122091">
             <w:r>
               <w:rPr>
                 <w:webHidden/>
@@ -418,7 +418,7 @@
             </w:tabs>
             <w:rPr/>
           </w:pPr>
-          <w:hyperlink w:anchor="__RefHeading___Toc777_3257256328">
+          <w:hyperlink w:anchor="__RefHeading___Toc777_1665122091">
             <w:r>
               <w:rPr>
                 <w:webHidden/>
@@ -445,7 +445,7 @@
             </w:tabs>
             <w:rPr/>
           </w:pPr>
-          <w:hyperlink w:anchor="__RefHeading___Toc779_3257256328">
+          <w:hyperlink w:anchor="__RefHeading___Toc779_1665122091">
             <w:r>
               <w:rPr>
                 <w:webHidden/>
@@ -472,7 +472,7 @@
             </w:tabs>
             <w:rPr/>
           </w:pPr>
-          <w:hyperlink w:anchor="__RefHeading___Toc781_3257256328">
+          <w:hyperlink w:anchor="__RefHeading___Toc781_1665122091">
             <w:r>
               <w:rPr>
                 <w:webHidden/>
@@ -499,7 +499,7 @@
             </w:tabs>
             <w:rPr/>
           </w:pPr>
-          <w:hyperlink w:anchor="__RefHeading___Toc783_3257256328">
+          <w:hyperlink w:anchor="__RefHeading___Toc783_1665122091">
             <w:r>
               <w:rPr>
                 <w:webHidden/>
@@ -526,7 +526,7 @@
             </w:tabs>
             <w:rPr/>
           </w:pPr>
-          <w:hyperlink w:anchor="__RefHeading___Toc785_3257256328">
+          <w:hyperlink w:anchor="__RefHeading___Toc785_1665122091">
             <w:r>
               <w:rPr>
                 <w:webHidden/>
@@ -553,7 +553,7 @@
             </w:tabs>
             <w:rPr/>
           </w:pPr>
-          <w:hyperlink w:anchor="__RefHeading___Toc787_3257256328">
+          <w:hyperlink w:anchor="__RefHeading___Toc787_1665122091">
             <w:r>
               <w:rPr>
                 <w:webHidden/>
@@ -580,7 +580,7 @@
             </w:tabs>
             <w:rPr/>
           </w:pPr>
-          <w:hyperlink w:anchor="__RefHeading___Toc789_3257256328">
+          <w:hyperlink w:anchor="__RefHeading___Toc789_1665122091">
             <w:r>
               <w:rPr>
                 <w:webHidden/>
@@ -607,7 +607,7 @@
             </w:tabs>
             <w:rPr/>
           </w:pPr>
-          <w:hyperlink w:anchor="__RefHeading___Toc791_3257256328">
+          <w:hyperlink w:anchor="__RefHeading___Toc791_1665122091">
             <w:r>
               <w:rPr>
                 <w:webHidden/>
@@ -634,7 +634,7 @@
             </w:tabs>
             <w:rPr/>
           </w:pPr>
-          <w:hyperlink w:anchor="__RefHeading___Toc793_3257256328">
+          <w:hyperlink w:anchor="__RefHeading___Toc793_1665122091">
             <w:r>
               <w:rPr>
                 <w:webHidden/>
@@ -661,7 +661,7 @@
             </w:tabs>
             <w:rPr/>
           </w:pPr>
-          <w:hyperlink w:anchor="__RefHeading___Toc795_3257256328">
+          <w:hyperlink w:anchor="__RefHeading___Toc795_1665122091">
             <w:r>
               <w:rPr>
                 <w:webHidden/>
@@ -720,7 +720,7 @@
         <w:spacing w:before="0" w:after="160"/>
         <w:rPr/>
       </w:pPr>
-      <w:bookmarkStart w:id="0" w:name="__RefHeading___Toc769_3257256328"/>
+      <w:bookmarkStart w:id="0" w:name="__RefHeading___Toc769_1665122091"/>
       <w:bookmarkEnd w:id="0"/>
       <w:r>
         <w:rPr>
@@ -948,7 +948,7 @@
         </w:pBdr>
         <w:rPr/>
       </w:pPr>
-      <w:bookmarkStart w:id="1" w:name="__RefHeading___Toc771_3257256328"/>
+      <w:bookmarkStart w:id="1" w:name="__RefHeading___Toc771_1665122091"/>
       <w:bookmarkEnd w:id="1"/>
       <w:r>
         <w:rPr>
@@ -1066,7 +1066,7 @@
         </w:pBdr>
         <w:rPr/>
       </w:pPr>
-      <w:bookmarkStart w:id="2" w:name="__RefHeading___Toc773_3257256328"/>
+      <w:bookmarkStart w:id="2" w:name="__RefHeading___Toc773_1665122091"/>
       <w:bookmarkEnd w:id="2"/>
       <w:r>
         <w:rPr>
@@ -1569,7 +1569,7 @@
         </w:pBdr>
         <w:rPr/>
       </w:pPr>
-      <w:bookmarkStart w:id="3" w:name="__RefHeading___Toc775_3257256328"/>
+      <w:bookmarkStart w:id="3" w:name="__RefHeading___Toc775_1665122091"/>
       <w:bookmarkEnd w:id="3"/>
       <w:r>
         <w:rPr>
@@ -2763,7 +2763,7 @@
         </w:pBdr>
         <w:rPr/>
       </w:pPr>
-      <w:bookmarkStart w:id="4" w:name="__RefHeading___Toc777_3257256328"/>
+      <w:bookmarkStart w:id="4" w:name="__RefHeading___Toc777_1665122091"/>
       <w:bookmarkEnd w:id="4"/>
       <w:r>
         <w:rPr>
@@ -3481,7 +3481,7 @@
         </w:pBdr>
         <w:rPr/>
       </w:pPr>
-      <w:bookmarkStart w:id="5" w:name="__RefHeading___Toc779_3257256328"/>
+      <w:bookmarkStart w:id="5" w:name="__RefHeading___Toc779_1665122091"/>
       <w:bookmarkEnd w:id="5"/>
       <w:r>
         <w:rPr>
@@ -4802,7 +4802,7 @@
         </w:pBdr>
         <w:rPr/>
       </w:pPr>
-      <w:bookmarkStart w:id="6" w:name="__RefHeading___Toc781_3257256328"/>
+      <w:bookmarkStart w:id="6" w:name="__RefHeading___Toc781_1665122091"/>
       <w:bookmarkEnd w:id="6"/>
       <w:r>
         <w:rPr>
@@ -5583,7 +5583,7 @@
         </w:pBdr>
         <w:rPr/>
       </w:pPr>
-      <w:bookmarkStart w:id="7" w:name="__RefHeading___Toc783_3257256328"/>
+      <w:bookmarkStart w:id="7" w:name="__RefHeading___Toc783_1665122091"/>
       <w:bookmarkEnd w:id="7"/>
       <w:r>
         <w:rPr>
@@ -6051,7 +6051,7 @@
         </w:pBdr>
         <w:rPr/>
       </w:pPr>
-      <w:bookmarkStart w:id="8" w:name="__RefHeading___Toc785_3257256328"/>
+      <w:bookmarkStart w:id="8" w:name="__RefHeading___Toc785_1665122091"/>
       <w:bookmarkEnd w:id="8"/>
       <w:r>
         <w:rPr>
@@ -8623,7 +8623,7 @@
         </w:pBdr>
         <w:rPr/>
       </w:pPr>
-      <w:bookmarkStart w:id="9" w:name="__RefHeading___Toc787_3257256328"/>
+      <w:bookmarkStart w:id="9" w:name="__RefHeading___Toc787_1665122091"/>
       <w:bookmarkEnd w:id="9"/>
       <w:r>
         <w:rPr>
@@ -8871,7 +8871,7 @@
         </w:pBdr>
         <w:rPr/>
       </w:pPr>
-      <w:bookmarkStart w:id="10" w:name="__RefHeading___Toc789_3257256328"/>
+      <w:bookmarkStart w:id="10" w:name="__RefHeading___Toc789_1665122091"/>
       <w:bookmarkEnd w:id="10"/>
       <w:r>
         <w:rPr>
@@ -9262,7 +9262,7 @@
         </w:pBdr>
         <w:rPr/>
       </w:pPr>
-      <w:bookmarkStart w:id="11" w:name="__RefHeading___Toc791_3257256328"/>
+      <w:bookmarkStart w:id="11" w:name="__RefHeading___Toc791_1665122091"/>
       <w:bookmarkEnd w:id="11"/>
       <w:r>
         <w:rPr>
@@ -9598,7 +9598,7 @@
         </w:pBdr>
         <w:rPr/>
       </w:pPr>
-      <w:bookmarkStart w:id="12" w:name="__RefHeading___Toc793_3257256328"/>
+      <w:bookmarkStart w:id="12" w:name="__RefHeading___Toc793_1665122091"/>
       <w:bookmarkEnd w:id="12"/>
       <w:r>
         <w:rPr>
@@ -9720,7 +9720,7 @@
         </w:pBdr>
         <w:rPr/>
       </w:pPr>
-      <w:bookmarkStart w:id="13" w:name="__RefHeading___Toc795_3257256328"/>
+      <w:bookmarkStart w:id="13" w:name="__RefHeading___Toc795_1665122091"/>
       <w:bookmarkEnd w:id="13"/>
       <w:r>
         <w:rPr>

</xml_diff>

<commit_message>
Fix cover logo alignment and vertical balance in the PDF render
LibreOffice applies a default ~3.2mm frame margin to inline images,
overriding the docx's zero wrap distance — the converter now zeroes the
image margins via UNO before export, so the logo ink is flush with the
title margin (measured 148 vs 149px at 150dpi). The logo also sits
equidistant between the protective marking and the title (150px gaps
each side). Renames a loop variable that shadowed the prop() helper.

Co-Authored-By: Claude Fable 5 <noreply@anthropic.com>
Claude-Session: https://claude.ai/code/session_01YLo1WfwUDkbwfJEF3ZNVbB
</commit_message>
<xml_diff>
--- a/output/capability-note.docx
+++ b/output/capability-note.docx
@@ -5,6 +5,7 @@
     <w:p>
       <w:pPr>
         <w:pStyle w:val="Normal"/>
+        <w:spacing w:before="880" w:after="1280"/>
         <w:rPr/>
       </w:pPr>
       <w:r>
@@ -51,16 +52,6 @@
     <w:p>
       <w:pPr>
         <w:pStyle w:val="Normal"/>
-        <w:spacing w:before="0" w:after="1920"/>
-        <w:rPr/>
-      </w:pPr>
-      <w:r>
-        <w:rPr/>
-      </w:r>
-    </w:p>
-    <w:p>
-      <w:pPr>
-        <w:pStyle w:val="Normal"/>
         <w:pBdr>
           <w:bottom w:val="single" w:sz="20" w:space="10" w:color="C62026"/>
         </w:pBdr>
@@ -310,7 +301,7 @@
             </w:rPr>
             <w:fldChar w:fldCharType="separate"/>
           </w:r>
-          <w:hyperlink w:anchor="__RefHeading___Toc769_1665122091">
+          <w:hyperlink w:anchor="__RefHeading___Toc769_1957608149">
             <w:r>
               <w:rPr>
                 <w:webHidden/>
@@ -337,7 +328,7 @@
             </w:tabs>
             <w:rPr/>
           </w:pPr>
-          <w:hyperlink w:anchor="__RefHeading___Toc771_1665122091">
+          <w:hyperlink w:anchor="__RefHeading___Toc771_1957608149">
             <w:r>
               <w:rPr>
                 <w:webHidden/>
@@ -364,7 +355,7 @@
             </w:tabs>
             <w:rPr/>
           </w:pPr>
-          <w:hyperlink w:anchor="__RefHeading___Toc773_1665122091">
+          <w:hyperlink w:anchor="__RefHeading___Toc773_1957608149">
             <w:r>
               <w:rPr>
                 <w:webHidden/>
@@ -391,7 +382,7 @@
             </w:tabs>
             <w:rPr/>
           </w:pPr>
-          <w:hyperlink w:anchor="__RefHeading___Toc775_1665122091">
+          <w:hyperlink w:anchor="__RefHeading___Toc775_1957608149">
             <w:r>
               <w:rPr>
                 <w:webHidden/>
@@ -418,7 +409,7 @@
             </w:tabs>
             <w:rPr/>
           </w:pPr>
-          <w:hyperlink w:anchor="__RefHeading___Toc777_1665122091">
+          <w:hyperlink w:anchor="__RefHeading___Toc777_1957608149">
             <w:r>
               <w:rPr>
                 <w:webHidden/>
@@ -445,7 +436,7 @@
             </w:tabs>
             <w:rPr/>
           </w:pPr>
-          <w:hyperlink w:anchor="__RefHeading___Toc779_1665122091">
+          <w:hyperlink w:anchor="__RefHeading___Toc779_1957608149">
             <w:r>
               <w:rPr>
                 <w:webHidden/>
@@ -472,7 +463,7 @@
             </w:tabs>
             <w:rPr/>
           </w:pPr>
-          <w:hyperlink w:anchor="__RefHeading___Toc781_1665122091">
+          <w:hyperlink w:anchor="__RefHeading___Toc781_1957608149">
             <w:r>
               <w:rPr>
                 <w:webHidden/>
@@ -499,7 +490,7 @@
             </w:tabs>
             <w:rPr/>
           </w:pPr>
-          <w:hyperlink w:anchor="__RefHeading___Toc783_1665122091">
+          <w:hyperlink w:anchor="__RefHeading___Toc783_1957608149">
             <w:r>
               <w:rPr>
                 <w:webHidden/>
@@ -526,7 +517,7 @@
             </w:tabs>
             <w:rPr/>
           </w:pPr>
-          <w:hyperlink w:anchor="__RefHeading___Toc785_1665122091">
+          <w:hyperlink w:anchor="__RefHeading___Toc785_1957608149">
             <w:r>
               <w:rPr>
                 <w:webHidden/>
@@ -553,7 +544,7 @@
             </w:tabs>
             <w:rPr/>
           </w:pPr>
-          <w:hyperlink w:anchor="__RefHeading___Toc787_1665122091">
+          <w:hyperlink w:anchor="__RefHeading___Toc787_1957608149">
             <w:r>
               <w:rPr>
                 <w:webHidden/>
@@ -580,7 +571,7 @@
             </w:tabs>
             <w:rPr/>
           </w:pPr>
-          <w:hyperlink w:anchor="__RefHeading___Toc789_1665122091">
+          <w:hyperlink w:anchor="__RefHeading___Toc789_1957608149">
             <w:r>
               <w:rPr>
                 <w:webHidden/>
@@ -607,7 +598,7 @@
             </w:tabs>
             <w:rPr/>
           </w:pPr>
-          <w:hyperlink w:anchor="__RefHeading___Toc791_1665122091">
+          <w:hyperlink w:anchor="__RefHeading___Toc791_1957608149">
             <w:r>
               <w:rPr>
                 <w:webHidden/>
@@ -634,7 +625,7 @@
             </w:tabs>
             <w:rPr/>
           </w:pPr>
-          <w:hyperlink w:anchor="__RefHeading___Toc793_1665122091">
+          <w:hyperlink w:anchor="__RefHeading___Toc793_1957608149">
             <w:r>
               <w:rPr>
                 <w:webHidden/>
@@ -661,7 +652,7 @@
             </w:tabs>
             <w:rPr/>
           </w:pPr>
-          <w:hyperlink w:anchor="__RefHeading___Toc795_1665122091">
+          <w:hyperlink w:anchor="__RefHeading___Toc795_1957608149">
             <w:r>
               <w:rPr>
                 <w:webHidden/>
@@ -720,7 +711,7 @@
         <w:spacing w:before="0" w:after="160"/>
         <w:rPr/>
       </w:pPr>
-      <w:bookmarkStart w:id="0" w:name="__RefHeading___Toc769_1665122091"/>
+      <w:bookmarkStart w:id="0" w:name="__RefHeading___Toc769_1957608149"/>
       <w:bookmarkEnd w:id="0"/>
       <w:r>
         <w:rPr>
@@ -948,7 +939,7 @@
         </w:pBdr>
         <w:rPr/>
       </w:pPr>
-      <w:bookmarkStart w:id="1" w:name="__RefHeading___Toc771_1665122091"/>
+      <w:bookmarkStart w:id="1" w:name="__RefHeading___Toc771_1957608149"/>
       <w:bookmarkEnd w:id="1"/>
       <w:r>
         <w:rPr>
@@ -1066,7 +1057,7 @@
         </w:pBdr>
         <w:rPr/>
       </w:pPr>
-      <w:bookmarkStart w:id="2" w:name="__RefHeading___Toc773_1665122091"/>
+      <w:bookmarkStart w:id="2" w:name="__RefHeading___Toc773_1957608149"/>
       <w:bookmarkEnd w:id="2"/>
       <w:r>
         <w:rPr>
@@ -1569,7 +1560,7 @@
         </w:pBdr>
         <w:rPr/>
       </w:pPr>
-      <w:bookmarkStart w:id="3" w:name="__RefHeading___Toc775_1665122091"/>
+      <w:bookmarkStart w:id="3" w:name="__RefHeading___Toc775_1957608149"/>
       <w:bookmarkEnd w:id="3"/>
       <w:r>
         <w:rPr>
@@ -2763,7 +2754,7 @@
         </w:pBdr>
         <w:rPr/>
       </w:pPr>
-      <w:bookmarkStart w:id="4" w:name="__RefHeading___Toc777_1665122091"/>
+      <w:bookmarkStart w:id="4" w:name="__RefHeading___Toc777_1957608149"/>
       <w:bookmarkEnd w:id="4"/>
       <w:r>
         <w:rPr>
@@ -3481,7 +3472,7 @@
         </w:pBdr>
         <w:rPr/>
       </w:pPr>
-      <w:bookmarkStart w:id="5" w:name="__RefHeading___Toc779_1665122091"/>
+      <w:bookmarkStart w:id="5" w:name="__RefHeading___Toc779_1957608149"/>
       <w:bookmarkEnd w:id="5"/>
       <w:r>
         <w:rPr>
@@ -4802,7 +4793,7 @@
         </w:pBdr>
         <w:rPr/>
       </w:pPr>
-      <w:bookmarkStart w:id="6" w:name="__RefHeading___Toc781_1665122091"/>
+      <w:bookmarkStart w:id="6" w:name="__RefHeading___Toc781_1957608149"/>
       <w:bookmarkEnd w:id="6"/>
       <w:r>
         <w:rPr>
@@ -5583,7 +5574,7 @@
         </w:pBdr>
         <w:rPr/>
       </w:pPr>
-      <w:bookmarkStart w:id="7" w:name="__RefHeading___Toc783_1665122091"/>
+      <w:bookmarkStart w:id="7" w:name="__RefHeading___Toc783_1957608149"/>
       <w:bookmarkEnd w:id="7"/>
       <w:r>
         <w:rPr>
@@ -6051,7 +6042,7 @@
         </w:pBdr>
         <w:rPr/>
       </w:pPr>
-      <w:bookmarkStart w:id="8" w:name="__RefHeading___Toc785_1665122091"/>
+      <w:bookmarkStart w:id="8" w:name="__RefHeading___Toc785_1957608149"/>
       <w:bookmarkEnd w:id="8"/>
       <w:r>
         <w:rPr>
@@ -8623,7 +8614,7 @@
         </w:pBdr>
         <w:rPr/>
       </w:pPr>
-      <w:bookmarkStart w:id="9" w:name="__RefHeading___Toc787_1665122091"/>
+      <w:bookmarkStart w:id="9" w:name="__RefHeading___Toc787_1957608149"/>
       <w:bookmarkEnd w:id="9"/>
       <w:r>
         <w:rPr>
@@ -8871,7 +8862,7 @@
         </w:pBdr>
         <w:rPr/>
       </w:pPr>
-      <w:bookmarkStart w:id="10" w:name="__RefHeading___Toc789_1665122091"/>
+      <w:bookmarkStart w:id="10" w:name="__RefHeading___Toc789_1957608149"/>
       <w:bookmarkEnd w:id="10"/>
       <w:r>
         <w:rPr>
@@ -9262,7 +9253,7 @@
         </w:pBdr>
         <w:rPr/>
       </w:pPr>
-      <w:bookmarkStart w:id="11" w:name="__RefHeading___Toc791_1665122091"/>
+      <w:bookmarkStart w:id="11" w:name="__RefHeading___Toc791_1957608149"/>
       <w:bookmarkEnd w:id="11"/>
       <w:r>
         <w:rPr>
@@ -9598,7 +9589,7 @@
         </w:pBdr>
         <w:rPr/>
       </w:pPr>
-      <w:bookmarkStart w:id="12" w:name="__RefHeading___Toc793_1665122091"/>
+      <w:bookmarkStart w:id="12" w:name="__RefHeading___Toc793_1957608149"/>
       <w:bookmarkEnd w:id="12"/>
       <w:r>
         <w:rPr>
@@ -9720,7 +9711,7 @@
         </w:pBdr>
         <w:rPr/>
       </w:pPr>
-      <w:bookmarkStart w:id="13" w:name="__RefHeading___Toc795_1665122091"/>
+      <w:bookmarkStart w:id="13" w:name="__RefHeading___Toc795_1957608149"/>
       <w:bookmarkEnd w:id="13"/>
       <w:r>
         <w:rPr>

</xml_diff>

<commit_message>
Align capability note with v0.3 definitions (note v0.2)
Updates Section 3 to the v0.3 formal definitions: Performance Under
Pressure as the enabling, trainable human-performance capability
(interference-based wording); Combat Mindset as the combat-specific
expression with the full readiness-and-disposition definition; adds
the Army Combat Mindset Framework as the organising model and extends
the relationship-in-one-line summation. Regenerates web app, docx and
PDF; note version to Draft v0.2; service-worker cache bumped.

Co-Authored-By: Claude Fable 5 <noreply@anthropic.com>
Claude-Session: https://claude.ai/code/session_01YLo1WfwUDkbwfJEF3ZNVbB
</commit_message>
<xml_diff>
--- a/output/capability-note.docx
+++ b/output/capability-note.docx
@@ -199,7 +199,7 @@
           <w:color w:val="000000"/>
           <w:sz w:val="20"/>
         </w:rPr>
-        <w:t>Draft v0.1</w:t>
+        <w:t>Draft v0.2</w:t>
       </w:r>
     </w:p>
     <w:p>
@@ -301,7 +301,7 @@
             </w:rPr>
             <w:fldChar w:fldCharType="separate"/>
           </w:r>
-          <w:hyperlink w:anchor="__RefHeading___Toc769_1957608149">
+          <w:hyperlink w:anchor="__RefHeading___Toc772_3766900188">
             <w:r>
               <w:rPr>
                 <w:webHidden/>
@@ -328,7 +328,7 @@
             </w:tabs>
             <w:rPr/>
           </w:pPr>
-          <w:hyperlink w:anchor="__RefHeading___Toc771_1957608149">
+          <w:hyperlink w:anchor="__RefHeading___Toc774_3766900188">
             <w:r>
               <w:rPr>
                 <w:webHidden/>
@@ -355,7 +355,7 @@
             </w:tabs>
             <w:rPr/>
           </w:pPr>
-          <w:hyperlink w:anchor="__RefHeading___Toc773_1957608149">
+          <w:hyperlink w:anchor="__RefHeading___Toc776_3766900188">
             <w:r>
               <w:rPr>
                 <w:webHidden/>
@@ -382,7 +382,7 @@
             </w:tabs>
             <w:rPr/>
           </w:pPr>
-          <w:hyperlink w:anchor="__RefHeading___Toc775_1957608149">
+          <w:hyperlink w:anchor="__RefHeading___Toc778_3766900188">
             <w:r>
               <w:rPr>
                 <w:webHidden/>
@@ -409,7 +409,7 @@
             </w:tabs>
             <w:rPr/>
           </w:pPr>
-          <w:hyperlink w:anchor="__RefHeading___Toc777_1957608149">
+          <w:hyperlink w:anchor="__RefHeading___Toc780_3766900188">
             <w:r>
               <w:rPr>
                 <w:webHidden/>
@@ -436,7 +436,7 @@
             </w:tabs>
             <w:rPr/>
           </w:pPr>
-          <w:hyperlink w:anchor="__RefHeading___Toc779_1957608149">
+          <w:hyperlink w:anchor="__RefHeading___Toc782_3766900188">
             <w:r>
               <w:rPr>
                 <w:webHidden/>
@@ -463,7 +463,7 @@
             </w:tabs>
             <w:rPr/>
           </w:pPr>
-          <w:hyperlink w:anchor="__RefHeading___Toc781_1957608149">
+          <w:hyperlink w:anchor="__RefHeading___Toc784_3766900188">
             <w:r>
               <w:rPr>
                 <w:webHidden/>
@@ -490,7 +490,7 @@
             </w:tabs>
             <w:rPr/>
           </w:pPr>
-          <w:hyperlink w:anchor="__RefHeading___Toc783_1957608149">
+          <w:hyperlink w:anchor="__RefHeading___Toc786_3766900188">
             <w:r>
               <w:rPr>
                 <w:webHidden/>
@@ -517,7 +517,7 @@
             </w:tabs>
             <w:rPr/>
           </w:pPr>
-          <w:hyperlink w:anchor="__RefHeading___Toc785_1957608149">
+          <w:hyperlink w:anchor="__RefHeading___Toc788_3766900188">
             <w:r>
               <w:rPr>
                 <w:webHidden/>
@@ -544,7 +544,7 @@
             </w:tabs>
             <w:rPr/>
           </w:pPr>
-          <w:hyperlink w:anchor="__RefHeading___Toc787_1957608149">
+          <w:hyperlink w:anchor="__RefHeading___Toc790_3766900188">
             <w:r>
               <w:rPr>
                 <w:webHidden/>
@@ -558,7 +558,7 @@
                 <w:rStyle w:val="IndexLink"/>
               </w:rPr>
               <w:tab/>
-              <w:t>13</w:t>
+              <w:t>14</w:t>
             </w:r>
           </w:hyperlink>
         </w:p>
@@ -571,7 +571,7 @@
             </w:tabs>
             <w:rPr/>
           </w:pPr>
-          <w:hyperlink w:anchor="__RefHeading___Toc789_1957608149">
+          <w:hyperlink w:anchor="__RefHeading___Toc792_3766900188">
             <w:r>
               <w:rPr>
                 <w:webHidden/>
@@ -598,7 +598,7 @@
             </w:tabs>
             <w:rPr/>
           </w:pPr>
-          <w:hyperlink w:anchor="__RefHeading___Toc791_1957608149">
+          <w:hyperlink w:anchor="__RefHeading___Toc794_3766900188">
             <w:r>
               <w:rPr>
                 <w:webHidden/>
@@ -625,7 +625,7 @@
             </w:tabs>
             <w:rPr/>
           </w:pPr>
-          <w:hyperlink w:anchor="__RefHeading___Toc793_1957608149">
+          <w:hyperlink w:anchor="__RefHeading___Toc796_3766900188">
             <w:r>
               <w:rPr>
                 <w:webHidden/>
@@ -652,7 +652,7 @@
             </w:tabs>
             <w:rPr/>
           </w:pPr>
-          <w:hyperlink w:anchor="__RefHeading___Toc795_1957608149">
+          <w:hyperlink w:anchor="__RefHeading___Toc798_3766900188">
             <w:r>
               <w:rPr>
                 <w:webHidden/>
@@ -666,7 +666,7 @@
                 <w:rStyle w:val="IndexLink"/>
               </w:rPr>
               <w:tab/>
-              <w:t>15</w:t>
+              <w:t>16</w:t>
             </w:r>
           </w:hyperlink>
           <w:r>
@@ -711,7 +711,7 @@
         <w:spacing w:before="0" w:after="160"/>
         <w:rPr/>
       </w:pPr>
-      <w:bookmarkStart w:id="0" w:name="__RefHeading___Toc769_1957608149"/>
+      <w:bookmarkStart w:id="0" w:name="__RefHeading___Toc772_3766900188"/>
       <w:bookmarkEnd w:id="0"/>
       <w:r>
         <w:rPr>
@@ -939,7 +939,7 @@
         </w:pBdr>
         <w:rPr/>
       </w:pPr>
-      <w:bookmarkStart w:id="1" w:name="__RefHeading___Toc771_1957608149"/>
+      <w:bookmarkStart w:id="1" w:name="__RefHeading___Toc774_3766900188"/>
       <w:bookmarkEnd w:id="1"/>
       <w:r>
         <w:rPr>
@@ -1057,7 +1057,7 @@
         </w:pBdr>
         <w:rPr/>
       </w:pPr>
-      <w:bookmarkStart w:id="2" w:name="__RefHeading___Toc773_1957608149"/>
+      <w:bookmarkStart w:id="2" w:name="__RefHeading___Toc776_3766900188"/>
       <w:bookmarkEnd w:id="2"/>
       <w:r>
         <w:rPr>
@@ -1560,7 +1560,7 @@
         </w:pBdr>
         <w:rPr/>
       </w:pPr>
-      <w:bookmarkStart w:id="3" w:name="__RefHeading___Toc775_1957608149"/>
+      <w:bookmarkStart w:id="3" w:name="__RefHeading___Toc778_3766900188"/>
       <w:bookmarkEnd w:id="3"/>
       <w:r>
         <w:rPr>
@@ -1614,7 +1614,7 @@
           <w:b w:val="false"/>
           <w:i w:val="false"/>
         </w:rPr>
-        <w:t>The overarching capability.</w:t>
+        <w:t>The enabling, trainable human-performance capability.</w:t>
       </w:r>
     </w:p>
     <w:p>
@@ -1630,7 +1630,7 @@
           <w:b w:val="false"/>
           <w:i/>
         </w:rPr>
-        <w:t>Performance Under Pressure is the trained individual and collective capacity to prepare for, remain effective through, adapt within and recover from demanding conditions, while preserving judgement, disciplined behaviour, cohesion and mission effectiveness.</w:t>
+        <w:t>Performance Under Pressure is the trainable individual and collective human-performance capability to prepare for, maintain effective performance through, adapt within and recover from conditions that create significant physiological, cognitive, emotional or social interference.</w:t>
       </w:r>
     </w:p>
     <w:p>
@@ -2023,7 +2023,7 @@
           <w:b w:val="false"/>
           <w:i/>
         </w:rPr>
-        <w:t>Combat Mindset is the readiness and trained ability to act decisively, persistently and ethically in the presence of enemy action, danger, uncertainty, fatigue and consequence.</w:t>
+        <w:t>Combat Mindset is the combat-specific expression of Performance Under Pressure: the individual and collective readiness and disposition to remain effective and act decisively, persistently, adaptively and ethically under the threat, adversity and uncertainty of combat in order to achieve the mission.</w:t>
       </w:r>
     </w:p>
     <w:p>
@@ -2695,6 +2695,52 @@
           <w:vertAlign w:val="superscript"/>
         </w:rPr>
         <w:t>1</w:t>
+      </w:r>
+    </w:p>
+    <w:p>
+      <w:pPr>
+        <w:pStyle w:val="Heading2"/>
+        <w:rPr/>
+      </w:pPr>
+      <w:r>
+        <w:rPr>
+          <w:rFonts w:cs="Arial" w:ascii="Arial" w:hAnsi="Arial"/>
+          <w:b/>
+          <w:i w:val="false"/>
+          <w:color w:val="000000"/>
+          <w:sz w:val="22"/>
+        </w:rPr>
+        <w:t>The Army Combat Mindset Framework</w:t>
+      </w:r>
+    </w:p>
+    <w:p>
+      <w:pPr>
+        <w:pStyle w:val="Normal"/>
+        <w:rPr/>
+      </w:pPr>
+      <w:r>
+        <w:rPr>
+          <w:rFonts w:cs="Book Antiqua"/>
+          <w:b w:val="false"/>
+          <w:i w:val="false"/>
+        </w:rPr>
+        <w:t>The organising model.</w:t>
+      </w:r>
+    </w:p>
+    <w:p>
+      <w:pPr>
+        <w:pStyle w:val="Normal"/>
+        <w:spacing w:before="120" w:after="160"/>
+        <w:ind w:left="567" w:right="567"/>
+        <w:rPr/>
+      </w:pPr>
+      <w:r>
+        <w:rPr>
+          <w:rFonts w:cs="Book Antiqua"/>
+          <w:b w:val="false"/>
+          <w:i/>
+        </w:rPr>
+        <w:t>The Army Combat Mindset Framework is the organising model through which Army defines, develops, integrates and assures the individual and collective capabilities that enable Combat Mindset.</w:t>
       </w:r>
     </w:p>
     <w:p>
@@ -2730,7 +2776,7 @@
           <w:b/>
           <w:i w:val="false"/>
         </w:rPr>
-        <w:t>Performance Under Pressure is the capability. Resilience sustains it. Combat Mindset is its expression in combat. Mental skills are how it is trained and applied.</w:t>
+        <w:t>Performance Under Pressure is the capability. Resilience sustains it. Combat Mindset is its expression in combat. Mental skills are how it is trained and applied. The Army Combat Mindset Framework organises how the capability is defined, developed, integrated and assured.</w:t>
       </w:r>
     </w:p>
     <w:p>
@@ -2754,7 +2800,7 @@
         </w:pBdr>
         <w:rPr/>
       </w:pPr>
-      <w:bookmarkStart w:id="4" w:name="__RefHeading___Toc777_1957608149"/>
+      <w:bookmarkStart w:id="4" w:name="__RefHeading___Toc780_3766900188"/>
       <w:bookmarkEnd w:id="4"/>
       <w:r>
         <w:rPr>
@@ -3472,7 +3518,7 @@
         </w:pBdr>
         <w:rPr/>
       </w:pPr>
-      <w:bookmarkStart w:id="5" w:name="__RefHeading___Toc779_1957608149"/>
+      <w:bookmarkStart w:id="5" w:name="__RefHeading___Toc782_3766900188"/>
       <w:bookmarkEnd w:id="5"/>
       <w:r>
         <w:rPr>
@@ -4793,7 +4839,7 @@
         </w:pBdr>
         <w:rPr/>
       </w:pPr>
-      <w:bookmarkStart w:id="6" w:name="__RefHeading___Toc781_1957608149"/>
+      <w:bookmarkStart w:id="6" w:name="__RefHeading___Toc784_3766900188"/>
       <w:bookmarkEnd w:id="6"/>
       <w:r>
         <w:rPr>
@@ -5574,7 +5620,7 @@
         </w:pBdr>
         <w:rPr/>
       </w:pPr>
-      <w:bookmarkStart w:id="7" w:name="__RefHeading___Toc783_1957608149"/>
+      <w:bookmarkStart w:id="7" w:name="__RefHeading___Toc786_3766900188"/>
       <w:bookmarkEnd w:id="7"/>
       <w:r>
         <w:rPr>
@@ -6042,7 +6088,7 @@
         </w:pBdr>
         <w:rPr/>
       </w:pPr>
-      <w:bookmarkStart w:id="8" w:name="__RefHeading___Toc785_1957608149"/>
+      <w:bookmarkStart w:id="8" w:name="__RefHeading___Toc788_3766900188"/>
       <w:bookmarkEnd w:id="8"/>
       <w:r>
         <w:rPr>
@@ -8614,7 +8660,7 @@
         </w:pBdr>
         <w:rPr/>
       </w:pPr>
-      <w:bookmarkStart w:id="9" w:name="__RefHeading___Toc787_1957608149"/>
+      <w:bookmarkStart w:id="9" w:name="__RefHeading___Toc790_3766900188"/>
       <w:bookmarkEnd w:id="9"/>
       <w:r>
         <w:rPr>
@@ -8862,7 +8908,7 @@
         </w:pBdr>
         <w:rPr/>
       </w:pPr>
-      <w:bookmarkStart w:id="10" w:name="__RefHeading___Toc789_1957608149"/>
+      <w:bookmarkStart w:id="10" w:name="__RefHeading___Toc792_3766900188"/>
       <w:bookmarkEnd w:id="10"/>
       <w:r>
         <w:rPr>
@@ -9253,7 +9299,7 @@
         </w:pBdr>
         <w:rPr/>
       </w:pPr>
-      <w:bookmarkStart w:id="11" w:name="__RefHeading___Toc791_1957608149"/>
+      <w:bookmarkStart w:id="11" w:name="__RefHeading___Toc794_3766900188"/>
       <w:bookmarkEnd w:id="11"/>
       <w:r>
         <w:rPr>
@@ -9589,7 +9635,7 @@
         </w:pBdr>
         <w:rPr/>
       </w:pPr>
-      <w:bookmarkStart w:id="12" w:name="__RefHeading___Toc793_1957608149"/>
+      <w:bookmarkStart w:id="12" w:name="__RefHeading___Toc796_3766900188"/>
       <w:bookmarkEnd w:id="12"/>
       <w:r>
         <w:rPr>
@@ -9711,7 +9757,7 @@
         </w:pBdr>
         <w:rPr/>
       </w:pPr>
-      <w:bookmarkStart w:id="13" w:name="__RefHeading___Toc795_1957608149"/>
+      <w:bookmarkStart w:id="13" w:name="__RefHeading___Toc798_3766900188"/>
       <w:bookmarkEnd w:id="13"/>
       <w:r>
         <w:rPr>
@@ -10025,7 +10071,7 @@
         <w:sz w:val="17"/>
         <w:rFonts w:cs="Arial" w:ascii="Arial" w:hAnsi="Arial"/>
       </w:rPr>
-      <w:t>15</w:t>
+      <w:t>16</w:t>
     </w:r>
     <w:r>
       <w:rPr>
@@ -10069,7 +10115,7 @@
         <w:sz w:val="17"/>
         <w:rFonts w:cs="Arial" w:ascii="Arial" w:hAnsi="Arial"/>
       </w:rPr>
-      <w:t>15</w:t>
+      <w:t>16</w:t>
     </w:r>
     <w:r>
       <w:rPr>

</xml_diff>